<commit_message>
docs: fix skills table alignment in Software Engineer resume
</commit_message>
<xml_diff>
--- a/public/IgorGarcia_Software_Development_Engineer.docx
+++ b/public/IgorGarcia_Software_Development_Engineer.docx
@@ -354,58 +354,7 @@
                 <w:b/>
                 <w:bCs/>
               </w:rPr>
-              <w:t>Cloud &amp; Backend</w:t>
-            </w:r>
-            <w:r>
-              <w:rPr>
-                <w:b/>
-                <w:bCs/>
-              </w:rPr>
-              <w:t xml:space="preserve">: </w:t>
-            </w:r>
-          </w:p>
-          <w:p>
-            <w:pPr>
-              <w:rPr>
-                <w:b/>
-                <w:bCs/>
-              </w:rPr>
-            </w:pPr>
-            <w:r>
-              <w:rPr>
-                <w:b/>
-                <w:bCs/>
-              </w:rPr>
-              <w:t>DevOps &amp; Tools</w:t>
-            </w:r>
-            <w:r>
-              <w:rPr>
-                <w:b/>
-                <w:bCs/>
-              </w:rPr>
-              <w:t xml:space="preserve">: </w:t>
-            </w:r>
-          </w:p>
-          <w:p>
-            <w:pPr>
-              <w:rPr>
-                <w:b/>
-                <w:bCs/>
-              </w:rPr>
-            </w:pPr>
-            <w:r>
-              <w:rPr>
-                <w:b/>
-                <w:bCs/>
-              </w:rPr>
-              <w:t>Additional (background):</w:t>
-            </w:r>
-            <w:r>
-              <w:rPr>
-                <w:b/>
-                <w:bCs/>
-              </w:rPr>
-              <w:t xml:space="preserve"> </w:t>
+              <w:t xml:space="preserve">Cloud &amp; Backend:</w:t>
             </w:r>
           </w:p>
         </w:tc>
@@ -419,21 +368,87 @@
           </w:tcPr>
           <w:p>
             <w:r>
+              <w:t xml:space="preserve">AWS (Lambda, API Gateway, DynamoDB, SQS, CloudWatch), ASP.NET Core, Serverless Architecture, Microservices</w:t>
+            </w:r>
+          </w:p>
+        </w:tc>
+      </w:tr>
+      <w:tr>
+        <w:tc>
+          <w:tcPr>
+            <w:tcW w:w="1890" w:type="dxa"/>
+            <w:tcMar>
+              <w:left w:w="0" w:type="dxa"/>
+              <w:right w:w="0" w:type="dxa"/>
+            </w:tcMar>
+          </w:tcPr>
+          <w:p>
+            <w:pPr>
               <w:rPr>
                 <w:b/>
                 <w:bCs/>
               </w:rPr>
-              <w:t xml:space="preserve">AWS (Lambda, API Gateway, DynamoDB, SQS, CloudWatch), ASP.NET Core, Serverless Architecture, Microservices.  Docker, Docker Compose, CI/CD (GitHub Actions – build, test, deploy pipelines), Git, Linux/OS fundamentals, Automated Tooling         </w:t>
+            </w:pPr>
+            <w:r>
+              <w:rPr>
+                <w:b/>
+                <w:bCs/>
+              </w:rPr>
+              <w:t xml:space="preserve">DevOps &amp; Tools:</w:t>
             </w:r>
-            <w:r/>
-            <w:r/>
-            <w:r/>
-            <w:r/>
           </w:p>
-          <w:p/>
+        </w:tc>
+        <w:tc>
+          <w:tcPr>
+            <w:tcW w:w="8621" w:type="dxa"/>
+            <w:tcMar>
+              <w:left w:w="0" w:type="dxa"/>
+              <w:right w:w="0" w:type="dxa"/>
+            </w:tcMar>
+          </w:tcPr>
           <w:p>
             <w:r>
-              <w:t>Unreal Engine 5 (C++/Blueprint), Unity (C#), multiplayer networking/replication, profiling/optimization</w:t>
+              <w:t xml:space="preserve">Docker, Docker Compose, CI/CD (GitHub Actions – build, test, deploy pipelines), Git, Linux/OS fundamentals, Automated Tooling</w:t>
+            </w:r>
+          </w:p>
+        </w:tc>
+      </w:tr>
+      <w:tr>
+        <w:tc>
+          <w:tcPr>
+            <w:tcW w:w="1890" w:type="dxa"/>
+            <w:tcMar>
+              <w:left w:w="0" w:type="dxa"/>
+              <w:right w:w="0" w:type="dxa"/>
+            </w:tcMar>
+          </w:tcPr>
+          <w:p>
+            <w:pPr>
+              <w:rPr>
+                <w:b/>
+                <w:bCs/>
+              </w:rPr>
+            </w:pPr>
+            <w:r>
+              <w:rPr>
+                <w:b/>
+                <w:bCs/>
+              </w:rPr>
+              <w:t xml:space="preserve">Additional (background):</w:t>
+            </w:r>
+          </w:p>
+        </w:tc>
+        <w:tc>
+          <w:tcPr>
+            <w:tcW w:w="8621" w:type="dxa"/>
+            <w:tcMar>
+              <w:left w:w="0" w:type="dxa"/>
+              <w:right w:w="0" w:type="dxa"/>
+            </w:tcMar>
+          </w:tcPr>
+          <w:p>
+            <w:r>
+              <w:t xml:space="preserve">Unreal Engine 5 (C++/Blueprint), Unity (C#), multiplayer networking/replication, profiling/optimization</w:t>
             </w:r>
           </w:p>
         </w:tc>

</xml_diff>

<commit_message>
Refactor CV and add new scripts for opportunity assessment
- Updated Igor Garcia's CV with new work experience entries, including roles at Ford Motor Company and Cafundo Creative Studio.
- Enhanced project descriptions and optimized formatting in the CV.
- Added scripts to generate an Opportunity Assessment Excel file with job roles, ratings, and motivations.
- Created a second version of the assessment script with improved formatting and dynamic row height adjustments based on content.
- Introduced a script to read assessment data from an existing Excel file.
- Implemented a script to fill a SEKROND consultant-profile template with real data while preserving formatting.
</commit_message>
<xml_diff>
--- a/public/IgorGarcia_Software_Development_Engineer.docx
+++ b/public/IgorGarcia_Software_Development_Engineer.docx
@@ -105,12 +105,14 @@
         <w:t xml:space="preserve">, </w:t>
       </w:r>
       <w:hyperlink r:id="rId9" w:history="1">
+        <w:proofErr w:type="spellStart"/>
         <w:r>
           <w:rPr>
             <w:rStyle w:val="Hyperlink"/>
           </w:rPr>
           <w:t>Github</w:t>
         </w:r>
+        <w:proofErr w:type="spellEnd"/>
         <w:r>
           <w:t xml:space="preserve"> </w:t>
         </w:r>
@@ -483,6 +485,112 @@
           <w:sz w:val="16"/>
           <w:szCs w:val="16"/>
         </w:rPr>
+        <w:t>Virtual Reality Researcher, Ford Motor Company</w:t>
+      </w:r>
+      <w:r>
+        <w:tab/>
+      </w:r>
+    </w:p>
+    <w:p>
+      <w:pPr>
+        <w:spacing w:after="80"/>
+      </w:pPr>
+      <w:r>
+        <w:rPr>
+          <w:color w:val="959BA6"/>
+          <w:sz w:val="16"/>
+          <w:szCs w:val="16"/>
+        </w:rPr>
+        <w:t>Aug 2021 — Dec 2022</w:t>
+      </w:r>
+    </w:p>
+    <w:p>
+      <w:pPr>
+        <w:pStyle w:val="ListParagraph"/>
+        <w:numPr>
+          <w:ilvl w:val="0"/>
+          <w:numId w:val="5"/>
+        </w:numPr>
+        <w:spacing w:line="240" w:lineRule="auto"/>
+      </w:pPr>
+      <w:r>
+        <w:t xml:space="preserve">Spearheaded R&amp;D for automotive VR applications, establishing foundational workflows that were later adopted as the </w:t>
+      </w:r>
+      <w:r>
+        <w:rPr>
+          <w:b/>
+          <w:bCs/>
+        </w:rPr>
+        <w:t xml:space="preserve">company standard for virtual </w:t>
+      </w:r>
+      <w:proofErr w:type="gramStart"/>
+      <w:r>
+        <w:rPr>
+          <w:b/>
+          <w:bCs/>
+        </w:rPr>
+        <w:t xml:space="preserve">prototyping </w:t>
+      </w:r>
+      <w:r>
+        <w:t>.</w:t>
+      </w:r>
+      <w:proofErr w:type="gramEnd"/>
+      <w:r>
+        <w:t xml:space="preserve"> </w:t>
+      </w:r>
+    </w:p>
+    <w:p>
+      <w:pPr>
+        <w:pStyle w:val="ListParagraph"/>
+        <w:numPr>
+          <w:ilvl w:val="0"/>
+          <w:numId w:val="5"/>
+        </w:numPr>
+        <w:spacing w:line="240" w:lineRule="auto"/>
+      </w:pPr>
+      <w:r>
+        <w:t xml:space="preserve">Collaborated with Design and Engineering teams to translate physical requirements into virtual specifications, resulting in user assessment accuracy. </w:t>
+      </w:r>
+    </w:p>
+    <w:p>
+      <w:pPr>
+        <w:pStyle w:val="ListParagraph"/>
+        <w:numPr>
+          <w:ilvl w:val="0"/>
+          <w:numId w:val="5"/>
+        </w:numPr>
+        <w:spacing w:line="240" w:lineRule="auto"/>
+      </w:pPr>
+      <w:r>
+        <w:t xml:space="preserve">Developed initial prototypes for virtual user experience testing, validating key interaction concepts for future production. </w:t>
+      </w:r>
+    </w:p>
+    <w:p>
+      <w:pPr>
+        <w:tabs>
+          <w:tab w:val="right" w:pos="10512"/>
+        </w:tabs>
+        <w:rPr>
+          <w:b/>
+          <w:bCs/>
+          <w:sz w:val="16"/>
+          <w:szCs w:val="16"/>
+        </w:rPr>
+      </w:pPr>
+    </w:p>
+    <w:p>
+      <w:pPr>
+        <w:tabs>
+          <w:tab w:val="right" w:pos="10512"/>
+        </w:tabs>
+      </w:pPr>
+      <w:r>
+        <w:rPr>
+          <w:b/>
+          <w:bCs/>
+          <w:sz w:val="16"/>
+          <w:szCs w:val="16"/>
+        </w:rPr>
         <w:t>Software engineer/C++ developer, Ford Motor Company</w:t>
       </w:r>
       <w:r>
@@ -580,15 +688,6 @@
     </w:p>
     <w:p>
       <w:pPr>
-        <w:spacing w:after="100"/>
-        <w:rPr>
-          <w:sz w:val="2"/>
-          <w:szCs w:val="2"/>
-        </w:rPr>
-      </w:pPr>
-    </w:p>
-    <w:p>
-      <w:pPr>
         <w:tabs>
           <w:tab w:val="right" w:pos="10512"/>
         </w:tabs>
@@ -600,7 +699,135 @@
           <w:sz w:val="16"/>
           <w:szCs w:val="16"/>
         </w:rPr>
-        <w:t>Software engineer, Cafundo Creative Studio</w:t>
+        <w:t>Unreal Engine 5 Developer, Blue Gravity Studios</w:t>
+      </w:r>
+      <w:r>
+        <w:tab/>
+      </w:r>
+    </w:p>
+    <w:p>
+      <w:pPr>
+        <w:spacing w:after="80"/>
+      </w:pPr>
+      <w:r>
+        <w:rPr>
+          <w:color w:val="959BA6"/>
+          <w:sz w:val="16"/>
+          <w:szCs w:val="16"/>
+        </w:rPr>
+        <w:t>Jan 2024 — Sep 2024</w:t>
+      </w:r>
+    </w:p>
+    <w:p>
+      <w:pPr>
+        <w:pStyle w:val="ListParagraph"/>
+        <w:numPr>
+          <w:ilvl w:val="0"/>
+          <w:numId w:val="4"/>
+        </w:numPr>
+      </w:pPr>
+      <w:r>
+        <w:t xml:space="preserve"> Engineered core network replication logic (TCP/UDP concepts) for multiplayer architecture using </w:t>
+      </w:r>
+      <w:r>
+        <w:rPr>
+          <w:b/>
+          <w:bCs/>
+        </w:rPr>
+        <w:t>C++</w:t>
+      </w:r>
+      <w:r>
+        <w:t xml:space="preserve">, optimizing bandwidth usage to support highly concurrent online sessions. </w:t>
+      </w:r>
+    </w:p>
+    <w:p>
+      <w:pPr>
+        <w:pStyle w:val="ListParagraph"/>
+        <w:numPr>
+          <w:ilvl w:val="0"/>
+          <w:numId w:val="4"/>
+        </w:numPr>
+      </w:pPr>
+      <w:r>
+        <w:t xml:space="preserve"> Developed core software systems, improving code modularity and reducing bug-fixing overhead by </w:t>
+      </w:r>
+      <w:r>
+        <w:rPr>
+          <w:b/>
+          <w:bCs/>
+        </w:rPr>
+        <w:t>20%</w:t>
+      </w:r>
+      <w:r>
+        <w:t xml:space="preserve"> for the engineering team. </w:t>
+      </w:r>
+    </w:p>
+    <w:p>
+      <w:pPr>
+        <w:pStyle w:val="ListParagraph"/>
+        <w:numPr>
+          <w:ilvl w:val="0"/>
+          <w:numId w:val="4"/>
+        </w:numPr>
+      </w:pPr>
+      <w:r>
+        <w:t xml:space="preserve"> Implemented scalable input systems and ensuring 100% compatibility across multiple platforms. </w:t>
+      </w:r>
+    </w:p>
+    <w:p>
+      <w:pPr>
+        <w:numPr>
+          <w:ilvl w:val="0"/>
+          <w:numId w:val="4"/>
+        </w:numPr>
+        <w:spacing w:before="100" w:beforeAutospacing="1" w:after="100" w:afterAutospacing="1" w:line="240" w:lineRule="auto"/>
+        <w:rPr>
+          <w:rFonts w:eastAsia="Times New Roman" w:cs="Times New Roman"/>
+          <w:color w:val="auto"/>
+        </w:rPr>
+      </w:pPr>
+      <w:r>
+        <w:rPr>
+          <w:rFonts w:eastAsia="Times New Roman" w:cs="Times New Roman"/>
+          <w:color w:val="auto"/>
+        </w:rPr>
+        <w:t>Collaborated with multidisciplinary teams to optimize memory usage and processing calls, enhancing overall performance on lower-end hardware.</w:t>
+      </w:r>
+    </w:p>
+    <w:p>
+      <w:pPr>
+        <w:tabs>
+          <w:tab w:val="right" w:pos="10512"/>
+        </w:tabs>
+      </w:pPr>
+      <w:r>
+        <w:rPr>
+          <w:b/>
+          <w:bCs/>
+          <w:sz w:val="16"/>
+          <w:szCs w:val="16"/>
+        </w:rPr>
+        <w:t xml:space="preserve">Software engineer, </w:t>
+      </w:r>
+      <w:proofErr w:type="spellStart"/>
+      <w:r>
+        <w:rPr>
+          <w:b/>
+          <w:bCs/>
+          <w:sz w:val="16"/>
+          <w:szCs w:val="16"/>
+        </w:rPr>
+        <w:t>Cafundo</w:t>
+      </w:r>
+      <w:proofErr w:type="spellEnd"/>
+      <w:r>
+        <w:rPr>
+          <w:b/>
+          <w:bCs/>
+          <w:sz w:val="16"/>
+          <w:szCs w:val="16"/>
+        </w:rPr>
+        <w:t xml:space="preserve"> Creative Studio</w:t>
       </w:r>
       <w:r>
         <w:tab/>
@@ -689,207 +916,12 @@
     </w:p>
     <w:p>
       <w:pPr>
-        <w:tabs>
-          <w:tab w:val="right" w:pos="10512"/>
-        </w:tabs>
-      </w:pPr>
-      <w:r>
-        <w:rPr>
-          <w:b/>
-          <w:bCs/>
-          <w:sz w:val="16"/>
-          <w:szCs w:val="16"/>
-        </w:rPr>
-        <w:t>Unreal Engine 5 Developer, Blue Gravity Studios</w:t>
-      </w:r>
-      <w:r>
-        <w:tab/>
-      </w:r>
-    </w:p>
-    <w:p>
-      <w:pPr>
-        <w:spacing w:after="80"/>
-      </w:pPr>
-      <w:r>
-        <w:rPr>
-          <w:color w:val="959BA6"/>
-          <w:sz w:val="16"/>
-          <w:szCs w:val="16"/>
-        </w:rPr>
-        <w:t>Jan 2024 — Sep 2024</w:t>
-      </w:r>
-    </w:p>
-    <w:p>
-      <w:pPr>
-        <w:pStyle w:val="ListParagraph"/>
-        <w:numPr>
-          <w:ilvl w:val="0"/>
-          <w:numId w:val="4"/>
-        </w:numPr>
-      </w:pPr>
-      <w:r>
-        <w:t xml:space="preserve"> Engineered core network replication logic (TCP/UDP concepts) for multiplayer architecture using </w:t>
-      </w:r>
-      <w:r>
-        <w:rPr>
-          <w:b/>
-          <w:bCs/>
-        </w:rPr>
-        <w:t>C++</w:t>
-      </w:r>
-      <w:r>
-        <w:t xml:space="preserve">, optimizing bandwidth usage to support highly concurrent online sessions. </w:t>
-      </w:r>
-    </w:p>
-    <w:p>
-      <w:pPr>
-        <w:pStyle w:val="ListParagraph"/>
-        <w:numPr>
-          <w:ilvl w:val="0"/>
-          <w:numId w:val="4"/>
-        </w:numPr>
-      </w:pPr>
-      <w:r>
-        <w:t xml:space="preserve"> Developed core software systems, improving code modularity and reducing bug-fixing overhead by </w:t>
-      </w:r>
-      <w:r>
-        <w:rPr>
-          <w:b/>
-          <w:bCs/>
-        </w:rPr>
-        <w:t>20%</w:t>
-      </w:r>
-      <w:r>
-        <w:t xml:space="preserve"> for the engineering team. </w:t>
-      </w:r>
-    </w:p>
-    <w:p>
-      <w:pPr>
-        <w:pStyle w:val="ListParagraph"/>
-        <w:numPr>
-          <w:ilvl w:val="0"/>
-          <w:numId w:val="4"/>
-        </w:numPr>
-      </w:pPr>
-      <w:r>
-        <w:t xml:space="preserve"> Implemented scalable input systems and ensuring 100% compatibility across multiple platforms. </w:t>
-      </w:r>
-    </w:p>
-    <w:p>
-      <w:pPr>
-        <w:numPr>
-          <w:ilvl w:val="0"/>
-          <w:numId w:val="4"/>
-        </w:numPr>
-        <w:spacing w:before="100" w:beforeAutospacing="1" w:after="100" w:afterAutospacing="1" w:line="240" w:lineRule="auto"/>
-        <w:rPr>
-          <w:rFonts w:eastAsia="Times New Roman" w:cs="Times New Roman"/>
-          <w:color w:val="auto"/>
-        </w:rPr>
-      </w:pPr>
-      <w:r>
-        <w:rPr>
-          <w:rFonts w:eastAsia="Times New Roman" w:cs="Times New Roman"/>
-          <w:color w:val="auto"/>
-        </w:rPr>
-        <w:t>Collaborated with multidisciplinary teams to optimize memory usage and processing calls, enhancing overall performance on lower-end hardware.</w:t>
-      </w:r>
-    </w:p>
-    <w:p>
-      <w:pPr>
         <w:spacing w:after="100"/>
         <w:rPr>
           <w:sz w:val="2"/>
           <w:szCs w:val="2"/>
         </w:rPr>
       </w:pPr>
-    </w:p>
-    <w:p>
-      <w:pPr>
-        <w:tabs>
-          <w:tab w:val="right" w:pos="10512"/>
-        </w:tabs>
-      </w:pPr>
-      <w:r>
-        <w:rPr>
-          <w:b/>
-          <w:bCs/>
-          <w:sz w:val="16"/>
-          <w:szCs w:val="16"/>
-        </w:rPr>
-        <w:t>Virtual Reality Researcher, Ford Motor Company</w:t>
-      </w:r>
-      <w:r>
-        <w:tab/>
-      </w:r>
-    </w:p>
-    <w:p>
-      <w:pPr>
-        <w:spacing w:after="80"/>
-      </w:pPr>
-      <w:r>
-        <w:rPr>
-          <w:color w:val="959BA6"/>
-          <w:sz w:val="16"/>
-          <w:szCs w:val="16"/>
-        </w:rPr>
-        <w:t>Aug 2021 — Dec 2022</w:t>
-      </w:r>
-    </w:p>
-    <w:p>
-      <w:pPr>
-        <w:pStyle w:val="ListParagraph"/>
-        <w:numPr>
-          <w:ilvl w:val="0"/>
-          <w:numId w:val="5"/>
-        </w:numPr>
-        <w:spacing w:line="240" w:lineRule="auto"/>
-      </w:pPr>
-      <w:r>
-        <w:t xml:space="preserve">Spearheaded R&amp;D for automotive VR applications, establishing foundational workflows that were later adopted as the </w:t>
-      </w:r>
-      <w:r>
-        <w:rPr>
-          <w:b/>
-          <w:bCs/>
-        </w:rPr>
-        <w:t xml:space="preserve">company standard for virtual prototyping </w:t>
-      </w:r>
-      <w:r>
-        <w:t xml:space="preserve">. </w:t>
-      </w:r>
-    </w:p>
-    <w:p>
-      <w:pPr>
-        <w:pStyle w:val="ListParagraph"/>
-        <w:numPr>
-          <w:ilvl w:val="0"/>
-          <w:numId w:val="5"/>
-        </w:numPr>
-        <w:spacing w:line="240" w:lineRule="auto"/>
-      </w:pPr>
-      <w:r>
-        <w:t>Collaborated with Design and Engineering teams to translate physical requirements into virtual specifications, resulting in</w:t>
-      </w:r>
-      <w:r>
-        <w:t xml:space="preserve"> </w:t>
-      </w:r>
-      <w:r>
-        <w:t xml:space="preserve">user assessment accuracy. </w:t>
-      </w:r>
-    </w:p>
-    <w:p>
-      <w:pPr>
-        <w:pStyle w:val="ListParagraph"/>
-        <w:numPr>
-          <w:ilvl w:val="0"/>
-          <w:numId w:val="5"/>
-        </w:numPr>
-        <w:spacing w:line="240" w:lineRule="auto"/>
-      </w:pPr>
-      <w:r>
-        <w:t xml:space="preserve">Developed initial prototypes for virtual user experience testing, validating key interaction concepts for future production. </w:t>
-      </w:r>
     </w:p>
     <w:p>
       <w:pPr>
@@ -1062,7 +1094,16 @@
         </w:tabs>
       </w:pPr>
       <w:r>
-        <w:t>Implemented secure auth (ASP.NET Identity + JWT in HttpOnly cookies) with user profiles and persistent analysis history.</w:t>
+        <w:lastRenderedPageBreak/>
+        <w:t xml:space="preserve">Implemented secure auth (ASP.NET Identity + JWT in </w:t>
+      </w:r>
+      <w:proofErr w:type="spellStart"/>
+      <w:r>
+        <w:t>HttpOnly</w:t>
+      </w:r>
+      <w:proofErr w:type="spellEnd"/>
+      <w:r>
+        <w:t xml:space="preserve"> cookies) with user profiles and persistent analysis history.</w:t>
       </w:r>
       <w:r>
         <w:rPr>
@@ -1085,8 +1126,15 @@
         </w:tabs>
       </w:pPr>
       <w:r>
-        <w:lastRenderedPageBreak/>
-        <w:t>Deployed via Docker on Render (backend) and Vercel (frontend) with PostgreSQL persistence.</w:t>
+        <w:t xml:space="preserve">Deployed via Docker on Render (backend) and </w:t>
+      </w:r>
+      <w:proofErr w:type="spellStart"/>
+      <w:r>
+        <w:t>Vercel</w:t>
+      </w:r>
+      <w:proofErr w:type="spellEnd"/>
+      <w:r>
+        <w:t xml:space="preserve"> (frontend) with PostgreSQL persistence.</w:t>
       </w:r>
     </w:p>
     <w:p>
@@ -1156,7 +1204,15 @@
         </w:rPr>
       </w:pPr>
       <w:r>
-        <w:t>A backend system built to continuously monitor</w:t>
+        <w:t xml:space="preserve">A backend system </w:t>
+      </w:r>
+      <w:proofErr w:type="gramStart"/>
+      <w:r>
+        <w:t>built</w:t>
+      </w:r>
+      <w:proofErr w:type="gramEnd"/>
+      <w:r>
+        <w:t xml:space="preserve"> to continuously monitor</w:t>
       </w:r>
       <w:r>
         <w:rPr>
@@ -1189,7 +1245,15 @@
         <w:t>Architecture &amp; Concurrency</w:t>
       </w:r>
       <w:r>
-        <w:t>: Designed an asynchronous backend utilizing IHostedService to manage concurrent background workers for continuous price monitoring and Telegram long-polling without blocking the main thread.</w:t>
+        <w:t xml:space="preserve">: Designed an asynchronous backend utilizing </w:t>
+      </w:r>
+      <w:proofErr w:type="spellStart"/>
+      <w:r>
+        <w:t>IHostedService</w:t>
+      </w:r>
+      <w:proofErr w:type="spellEnd"/>
+      <w:r>
+        <w:t xml:space="preserve"> to manage concurrent background workers for continuous price monitoring and Telegram long-polling without blocking the main thread.</w:t>
       </w:r>
     </w:p>
     <w:p>
@@ -1210,7 +1274,15 @@
         <w:t>Security &amp; Performance</w:t>
       </w:r>
       <w:r>
-        <w:t>: Implemented custom API key authentication (with SHA-256 hashing), global rate limiting, and IMemoryCache to drastically reduce redundant external calls and prevent rate-limit bans.</w:t>
+        <w:t xml:space="preserve">: Implemented custom API key authentication (with SHA-256 hashing), global rate limiting, and </w:t>
+      </w:r>
+      <w:proofErr w:type="spellStart"/>
+      <w:r>
+        <w:t>IMemoryCache</w:t>
+      </w:r>
+      <w:proofErr w:type="spellEnd"/>
+      <w:r>
+        <w:t xml:space="preserve"> to drastically reduce redundant external calls and prevent rate-limit bans.</w:t>
       </w:r>
     </w:p>
     <w:p>
@@ -1231,7 +1303,15 @@
         <w:t>Resilience &amp; Data</w:t>
       </w:r>
       <w:r>
-        <w:t>: Engineered a resilient scraping mechanism with HTML parsing fallbacks (HtmlAgilityPack) for unreliable external APIs, persisting user sessions and alerts via Entity Framework Core and SQLite.</w:t>
+        <w:t>: Engineered a resilient scraping mechanism with HTML parsing fallbacks (</w:t>
+      </w:r>
+      <w:proofErr w:type="spellStart"/>
+      <w:r>
+        <w:t>HtmlAgilityPack</w:t>
+      </w:r>
+      <w:proofErr w:type="spellEnd"/>
+      <w:r>
+        <w:t>) for unreliable external APIs, persisting user sessions and alerts via Entity Framework Core and SQLite.</w:t>
       </w:r>
     </w:p>
     <w:p>
@@ -1297,14 +1377,25 @@
           <w:szCs w:val="16"/>
         </w:rPr>
       </w:pPr>
-      <w:r>
-        <w:rPr>
-          <w:b/>
-          <w:bCs/>
-          <w:sz w:val="16"/>
-          <w:szCs w:val="16"/>
-        </w:rPr>
-        <w:t xml:space="preserve">Cripto Tracker | </w:t>
+      <w:proofErr w:type="spellStart"/>
+      <w:r>
+        <w:rPr>
+          <w:b/>
+          <w:bCs/>
+          <w:sz w:val="16"/>
+          <w:szCs w:val="16"/>
+        </w:rPr>
+        <w:t>Cripto</w:t>
+      </w:r>
+      <w:proofErr w:type="spellEnd"/>
+      <w:r>
+        <w:rPr>
+          <w:b/>
+          <w:bCs/>
+          <w:sz w:val="16"/>
+          <w:szCs w:val="16"/>
+        </w:rPr>
+        <w:t xml:space="preserve"> Tracker | </w:t>
       </w:r>
       <w:r>
         <w:rPr>
@@ -1372,7 +1463,15 @@
         <w:t>Vite</w:t>
       </w:r>
       <w:r>
-        <w:t xml:space="preserve"> to track real-time cryptocurrency prices via the CoinGecko API.</w:t>
+        <w:t xml:space="preserve"> to track real-time cryptocurrency prices via the </w:t>
+      </w:r>
+      <w:proofErr w:type="spellStart"/>
+      <w:r>
+        <w:t>CoinGecko</w:t>
+      </w:r>
+      <w:proofErr w:type="spellEnd"/>
+      <w:r>
+        <w:t xml:space="preserve"> API.</w:t>
       </w:r>
     </w:p>
     <w:p>
@@ -1396,6 +1495,7 @@
       <w:r>
         <w:t xml:space="preserve"> for secure user authentication (Google &amp; Email/Password) and </w:t>
       </w:r>
+      <w:proofErr w:type="spellStart"/>
       <w:r>
         <w:rPr>
           <w:b/>
@@ -1403,6 +1503,7 @@
         </w:rPr>
         <w:t>Firestore</w:t>
       </w:r>
+      <w:proofErr w:type="spellEnd"/>
       <w:r>
         <w:t xml:space="preserve"> database to manage user data.</w:t>
       </w:r>
@@ -1473,7 +1574,17 @@
           <w:sz w:val="16"/>
           <w:szCs w:val="16"/>
         </w:rPr>
-        <w:t xml:space="preserve">Professional Measurement Tool | Unreal Engine C++ (Fab / Unreal Marketplace, 2026)  </w:t>
+        <w:t>Professional Measurement Tool | Unreal Engine C++ (Fab / Unreal Marketplace, 2026</w:t>
+      </w:r>
+      <w:proofErr w:type="gramStart"/>
+      <w:r>
+        <w:rPr>
+          <w:b/>
+          <w:bCs/>
+          <w:sz w:val="16"/>
+          <w:szCs w:val="16"/>
+        </w:rPr>
+        <w:t xml:space="preserve">)  </w:t>
       </w:r>
       <w:r>
         <w:rPr>
@@ -1483,6 +1594,7 @@
         </w:rPr>
         <w:t>2026</w:t>
       </w:r>
+      <w:proofErr w:type="gramEnd"/>
     </w:p>
     <w:p>
       <w:pPr>
@@ -1499,7 +1611,23 @@
           <w:sz w:val="16"/>
           <w:szCs w:val="16"/>
         </w:rPr>
-        <w:t xml:space="preserve">Author of a C++ editor plugin that measures distances and enclosed polygon areas in-editor using USplineComponent, with real-time visual feedback and a dedicated Editor Mode. </w:t>
+        <w:t>Author of a C++ editor plugin that measures distances and enclosed polygon areas in-editor using </w:t>
+      </w:r>
+      <w:proofErr w:type="spellStart"/>
+      <w:r>
+        <w:rPr>
+          <w:sz w:val="16"/>
+          <w:szCs w:val="16"/>
+        </w:rPr>
+        <w:t>USplineComponent</w:t>
+      </w:r>
+      <w:proofErr w:type="spellEnd"/>
+      <w:r>
+        <w:rPr>
+          <w:sz w:val="16"/>
+          <w:szCs w:val="16"/>
+        </w:rPr>
+        <w:t xml:space="preserve">, with real-time visual feedback and a dedicated Editor Mode. </w:t>
       </w:r>
     </w:p>
     <w:p>
@@ -1521,7 +1649,23 @@
           <w:sz w:val="16"/>
           <w:szCs w:val="16"/>
         </w:rPr>
-        <w:t>Decoupled architecture using UInterface and multicast delegates, separating actor, widget, snap, and label logic into independent components.</w:t>
+        <w:t>Decoupled architecture using </w:t>
+      </w:r>
+      <w:proofErr w:type="spellStart"/>
+      <w:r>
+        <w:rPr>
+          <w:sz w:val="16"/>
+          <w:szCs w:val="16"/>
+        </w:rPr>
+        <w:t>UInterface</w:t>
+      </w:r>
+      <w:proofErr w:type="spellEnd"/>
+      <w:r>
+        <w:rPr>
+          <w:sz w:val="16"/>
+          <w:szCs w:val="16"/>
+        </w:rPr>
+        <w:t> and multicast delegates, separating actor, widget, snap, and label logic into independent components.</w:t>
       </w:r>
     </w:p>
     <w:p>
@@ -1565,7 +1709,23 @@
           <w:sz w:val="16"/>
           <w:szCs w:val="16"/>
         </w:rPr>
-        <w:t>Custom Editor Mode (FEdMode) with Slate toolkit panel for one-click spawning, selection, and property editing.</w:t>
+        <w:t>Custom Editor Mode (</w:t>
+      </w:r>
+      <w:proofErr w:type="spellStart"/>
+      <w:r>
+        <w:rPr>
+          <w:sz w:val="16"/>
+          <w:szCs w:val="16"/>
+        </w:rPr>
+        <w:t>FEdMode</w:t>
+      </w:r>
+      <w:proofErr w:type="spellEnd"/>
+      <w:r>
+        <w:rPr>
+          <w:sz w:val="16"/>
+          <w:szCs w:val="16"/>
+        </w:rPr>
+        <w:t>) with Slate toolkit panel for one-click spawning, selection, and property editing.</w:t>
       </w:r>
     </w:p>
     <w:p>
@@ -1620,7 +1780,17 @@
           <w:szCs w:val="16"/>
         </w:rPr>
         <w:br/>
-        <w:t>Runtime Skinned Mesh Exporter (Fab / Unreal Marketplace, 2025)</w:t>
+        <w:t>Runtime Skinned Mesh Exporter (Fab / Unreal Marketplace, 2025</w:t>
+      </w:r>
+      <w:proofErr w:type="gramStart"/>
+      <w:r>
+        <w:rPr>
+          <w:b/>
+          <w:bCs/>
+          <w:sz w:val="16"/>
+          <w:szCs w:val="16"/>
+        </w:rPr>
+        <w:t>)</w:t>
       </w:r>
       <w:r>
         <w:t xml:space="preserve">  </w:t>
@@ -1633,6 +1803,7 @@
         </w:rPr>
         <w:t>2025</w:t>
       </w:r>
+      <w:proofErr w:type="gramEnd"/>
     </w:p>
     <w:p>
       <w:pPr>
@@ -1668,7 +1839,23 @@
           <w:sz w:val="16"/>
           <w:szCs w:val="16"/>
         </w:rPr>
-        <w:t xml:space="preserve">Fully asynchronous pipeline: GPU→CPU transfer through FRHIGPUTextureReadback and PNG compression on the thread-pool, ensuring hitch-free operation. </w:t>
+        <w:t xml:space="preserve">Fully asynchronous pipeline: GPU→CPU transfer through </w:t>
+      </w:r>
+      <w:proofErr w:type="spellStart"/>
+      <w:r>
+        <w:rPr>
+          <w:sz w:val="16"/>
+          <w:szCs w:val="16"/>
+        </w:rPr>
+        <w:t>FRHIGPUTextureReadback</w:t>
+      </w:r>
+      <w:proofErr w:type="spellEnd"/>
+      <w:r>
+        <w:rPr>
+          <w:sz w:val="16"/>
+          <w:szCs w:val="16"/>
+        </w:rPr>
+        <w:t xml:space="preserve"> and PNG compression on the thread-pool, ensuring hitch-free operation. </w:t>
       </w:r>
     </w:p>
     <w:p>
@@ -1710,7 +1897,23 @@
           <w:sz w:val="16"/>
           <w:szCs w:val="16"/>
         </w:rPr>
-        <w:t xml:space="preserve">Managed the entire product lifecycle: ideation, development, documentation and multiproject testing </w:t>
+        <w:t xml:space="preserve">Managed the entire product lifecycle: ideation, development, documentation and </w:t>
+      </w:r>
+      <w:proofErr w:type="spellStart"/>
+      <w:r>
+        <w:rPr>
+          <w:sz w:val="16"/>
+          <w:szCs w:val="16"/>
+        </w:rPr>
+        <w:t>multiproject</w:t>
+      </w:r>
+      <w:proofErr w:type="spellEnd"/>
+      <w:r>
+        <w:rPr>
+          <w:sz w:val="16"/>
+          <w:szCs w:val="16"/>
+        </w:rPr>
+        <w:t xml:space="preserve"> testing </w:t>
       </w:r>
     </w:p>
     <w:p>
@@ -1973,6 +2176,7 @@
           <w:szCs w:val="16"/>
           <w:lang w:val="pt-BR"/>
         </w:rPr>
+        <w:lastRenderedPageBreak/>
         <w:t>University of Feira de Santana (UEFS), Feira de Santana</w:t>
       </w:r>
       <w:r>

</xml_diff>